<commit_message>
Resume: add Rent-ERP side project; fix Claude/Runner-Up typos
Insert a Rent-ERP entry under Personal and Side Projects (matching the
CampusQ entry style), fix "Claudde" -> "Claude" and "Runners-Up" ->
"Runner-Up". Validated: XML well-formed and opens cleanly in Word.

Co-Authored-By: Claude Opus 4.8 (1M context) <noreply@anthropic.com>
Claude-Session: https://claude.ai/code/session_01MRCsKuzQ7MG8G7HecgLZcv
</commit_message>
<xml_diff>
--- a/resume.docx
+++ b/resume.docx
@@ -388,7 +388,7 @@
           <w:szCs w:val="22"/>
           <w:rtl w:val="0"/>
         </w:rPr>
-        <w:t xml:space="preserve">Author Playwright end-to-end tests across all three apps — multi-project config with per-app auth and storage-state reuse, synthetic-persona data factories with automated cleanup, and traces/video-on-failure with CI-ready JUnit reporting — complementing Vitest unit coverage; leveraged AI agents (Claudde, OpenCode) to generate test data factories and review coverage gaps.</w:t>
+        <w:t xml:space="preserve">Author Playwright end-to-end tests across all three apps — multi-project config with per-app auth and storage-state reuse, synthetic-persona data factories with automated cleanup, and traces/video-on-failure with CI-ready JUnit reporting — complementing Vitest unit coverage; leveraged AI agents (Claude, OpenCode) to generate test data factories and review coverage gaps.</w:t>
       </w:r>
       <w:r>
         <w:rPr>
@@ -1039,6 +1039,33 @@
       <w:pPr>
         <w:pStyle w:val="Heading3"/>
         <w:keepNext w:val="1"/>
+        <w:spacing w:after="60" w:before="200" w:line="276" w:lineRule="auto"/>
+        <w:rPr>
+          <w:b w:val="0"/>
+          <w:bCs w:val="0"/>
+        </w:rPr>
+      </w:pPr>
+      <w:r>
+        <w:rPr>
+          <w:b w:val="1"/>
+          <w:bCs w:val="1"/>
+          <w:rtl w:val="0"/>
+        </w:rPr>
+        <w:t xml:space="preserve">Rent-ERP</w:t>
+      </w:r>
+      <w:r>
+        <w:rPr>
+          <w:b w:val="0"/>
+          <w:bCs w:val="0"/>
+          <w:rtl w:val="0"/>
+        </w:rPr>
+        <w:t xml:space="preserve"> — Single-organisation property-management ERP across three surfaces — .NET 10 modular monolith · Angular 21 admin console · React Native (Expo) tenant/employee app. Property hierarchy, per-tenant billing with bKash, accounting, HRM, and SMS/FCM notifications; permission-bitmask roles with persona switching; auto-migrate + seed, no SQL scripts. Reuses the CampusQ architecture, minus the multi-tenant SaaS layer.</w:t>
+      </w:r>
+    </w:p>
+    <w:p>
+      <w:pPr>
+        <w:pStyle w:val="Heading3"/>
+        <w:keepNext w:val="1"/>
         <w:spacing w:before="200" w:line="276" w:lineRule="auto"/>
         <w:rPr>
           <w:b w:val="0"/>
@@ -1167,7 +1194,7 @@
           <w:szCs w:val="22"/>
           <w:rtl w:val="0"/>
         </w:rPr>
-        <w:t xml:space="preserve">1st Runners-Up Prize, DevOps Hackathon hosted by Poridhi.io and Brain Station 23</w:t>
+        <w:t xml:space="preserve">1st Runner-Up Prize, DevOps Hackathon hosted by Poridhi.io and Brain Station 23</w:t>
       </w:r>
     </w:p>
     <w:p>

</xml_diff>

<commit_message>
Reflect promotion to Senior Software Engineer II (effective 2026-07-01)
- index.html: title/OG/Twitter meta, schema.org jobTitle, hero eyebrow,
  Netpower experience entry (role + promoted-Jul-2026 note)
- resume.docx: summary and Netpower heading with promotion note
- README.md, site.webmanifest: updated title
- og-image.png: regenerated card with new title

Co-Authored-By: Claude Fable 5 <noreply@anthropic.com>
Claude-Session: https://claude.ai/code/session_01JUJhnDimpidYSon4YRWqPa
</commit_message>
<xml_diff>
--- a/resume.docx
+++ b/resume.docx
@@ -165,7 +165,7 @@
           <w:szCs w:val="22"/>
           <w:rtl w:val="0"/>
         </w:rPr>
-        <w:t xml:space="preserve">Software engineer with 3+ years delivering enterprise </w:t>
+        <w:t xml:space="preserve">Senior software engineer with 3+ years delivering enterprise </w:t>
       </w:r>
       <w:r>
         <w:rPr>
@@ -269,7 +269,7 @@
           <w:bCs w:val="1"/>
           <w:rtl w:val="0"/>
         </w:rPr>
-        <w:t xml:space="preserve">Software Engineer</w:t>
+        <w:t xml:space="preserve">Senior Software Engineer II</w:t>
       </w:r>
       <w:r>
         <w:rPr>
@@ -283,7 +283,7 @@
           <w:iCs w:val="1"/>
           <w:rtl w:val="0"/>
         </w:rPr>
-        <w:t xml:space="preserve"> March 2026 – Present</w:t>
+        <w:t xml:space="preserve"> March 2026 – Present (promoted July 2026)</w:t>
       </w:r>
     </w:p>
     <w:p>

</xml_diff>

<commit_message>
Show promotion as LinkedIn-style two-role timeline; keep tagline humble
- Hero eyebrow, page title, OG/Twitter meta, manifest, README intro and
  og-image revert to plain "Software Engineer"
- Experience: Netpower entry becomes a grouped sub-timeline with
  Senior Software Engineer II (Jul 2026 - present) and Software Engineer
  (Mar 2026 - Jun 2026), each with its own bullets
- resume.docx: Netpower split into the same two stacked positions;
  earlier-role bullets moved to past tense

Co-Authored-By: Claude Fable 5 <noreply@anthropic.com>
Claude-Session: https://claude.ai/code/session_01JUJhnDimpidYSon4YRWqPa
</commit_message>
<xml_diff>
--- a/resume.docx
+++ b/resume.docx
@@ -283,7 +283,7 @@
           <w:iCs w:val="1"/>
           <w:rtl w:val="0"/>
         </w:rPr>
-        <w:t xml:space="preserve"> March 2026 – Present (promoted July 2026)</w:t>
+        <w:t xml:space="preserve"> July 2026 – Present</w:t>
       </w:r>
     </w:p>
     <w:p>
@@ -304,7 +304,7 @@
           <w:szCs w:val="22"/>
           <w:rtl w:val="0"/>
         </w:rPr>
-        <w:t xml:space="preserve">Build standalone, Signals-first Angular 21 features across the Deviation, Checklist, and Handbook modules for Certain QMS — signal/computed/effect stores scoped per route (ngRx signal store), reactive forms, functional guards/resolvers, lazy routes, and HTTP interceptors — under strict TypeScript and OnPush change detection; used Claude and Cursor agents to accelerate component scaffolding and TypeScript type design.</w:t>
+        <w:t xml:space="preserve">Drive signals-first Angular 21 feature delivery across the Deviation, Checklist, and Handbook modules of Certain QMS, with expanded ownership of module architecture and code review.</w:t>
       </w:r>
     </w:p>
     <w:p>
@@ -325,7 +325,39 @@
           <w:szCs w:val="22"/>
           <w:rtl w:val="0"/>
         </w:rPr>
-        <w:t xml:space="preserve">Deliver Chart.js analytics dashboards (donut, gauge, risk-matrix, trend) with saved-search and date-range filtering, plus multi-format export — locale-aware Excel (xlsx-js-style), styled Word (docx), and inline PDF — and Quill rich text editing for deviation records.</w:t>
+        <w:t xml:space="preserve">Own end-to-end quality across all three apps — Playwright e2e and Vitest strategy, with AI agents (Claude, OpenCode) generating test data factories and flagging coverage gaps.</w:t>
+      </w:r>
+    </w:p>
+    <w:p>
+      <w:pPr>
+        <w:pStyle w:val="Heading3"/>
+        <w:spacing w:before="0" w:lineRule="auto"/>
+        <w:rPr>
+          <w:i w:val="1"/>
+          <w:iCs w:val="1"/>
+        </w:rPr>
+      </w:pPr>
+      <w:r>
+        <w:rPr>
+          <w:b w:val="1"/>
+          <w:bCs w:val="1"/>
+          <w:rtl w:val="0"/>
+        </w:rPr>
+        <w:t xml:space="preserve">Software Engineer</w:t>
+      </w:r>
+      <w:r>
+        <w:rPr>
+          <w:rtl w:val="0"/>
+        </w:rPr>
+        <w:t xml:space="preserve">, Netpower,</w:t>
+      </w:r>
+      <w:r>
+        <w:rPr>
+          <w:i w:val="1"/>
+          <w:iCs w:val="1"/>
+          <w:rtl w:val="0"/>
+        </w:rPr>
+        <w:t xml:space="preserve"> March 2026 – June 2026</w:t>
       </w:r>
     </w:p>
     <w:p>
@@ -346,7 +378,7 @@
           <w:szCs w:val="22"/>
           <w:rtl w:val="0"/>
         </w:rPr>
-        <w:t xml:space="preserve">Contribute to a dual-authentication model: a JWT interceptor for internal users and a route-scoped OTP session flow enabling secure, read-only external sharing of deviation records without exposing internal logins.</w:t>
+        <w:t xml:space="preserve">Built standalone, Signals-first Angular 21 features across the Deviation, Checklist, and Handbook modules for Certain QMS — signal/computed/effect stores scoped per route (ngRx signal store), reactive forms, functional guards/resolvers, lazy routes, and HTTP interceptors — under strict TypeScript and OnPush change detection; used Claude and Cursor agents to accelerate component scaffolding and TypeScript type design.</w:t>
       </w:r>
     </w:p>
     <w:p>
@@ -367,7 +399,7 @@
           <w:szCs w:val="22"/>
           <w:rtl w:val="0"/>
         </w:rPr>
-        <w:t xml:space="preserve">Ship fully localized UI via @ngx-translate (Norwegian bokmål/nynorsk + English, 1,000+ keys) with locale-driven date/number formatting, extending shared sdk-ui/cdk-ui libraries on a Tailwind 4 + custom Angular Material design system.</w:t>
+        <w:t xml:space="preserve">Delivered Chart.js analytics dashboards (donut, gauge, risk-matrix, trend) with saved-search and date-range filtering, plus multi-format export — locale-aware Excel (xlsx-js-style), styled Word (docx), and inline PDF — and Quill rich text editing for deviation records.</w:t>
       </w:r>
     </w:p>
     <w:p>
@@ -388,7 +420,49 @@
           <w:szCs w:val="22"/>
           <w:rtl w:val="0"/>
         </w:rPr>
-        <w:t xml:space="preserve">Author Playwright end-to-end tests across all three apps — multi-project config with per-app auth and storage-state reuse, synthetic-persona data factories with automated cleanup, and traces/video-on-failure with CI-ready JUnit reporting — complementing Vitest unit coverage; leveraged AI agents (Claude, OpenCode) to generate test data factories and review coverage gaps.</w:t>
+        <w:t xml:space="preserve">Contributed to a dual-authentication model: a JWT interceptor for internal users and a route-scoped OTP session flow enabling secure, read-only external sharing of deviation records without exposing internal logins.</w:t>
+      </w:r>
+    </w:p>
+    <w:p>
+      <w:pPr>
+        <w:numPr>
+          <w:ilvl w:val="0"/>
+          <w:numId w:val="1"/>
+        </w:numPr>
+        <w:ind w:left="720" w:hanging="360"/>
+        <w:rPr>
+          <w:sz w:val="14"/>
+          <w:szCs w:val="14"/>
+        </w:rPr>
+      </w:pPr>
+      <w:r>
+        <w:rPr>
+          <w:sz w:val="22"/>
+          <w:szCs w:val="22"/>
+          <w:rtl w:val="0"/>
+        </w:rPr>
+        <w:t xml:space="preserve">Shipped fully localized UI via @ngx-translate (Norwegian bokmål/nynorsk + English, 1,000+ keys) with locale-driven date/number formatting, extending shared sdk-ui/cdk-ui libraries on a Tailwind 4 + custom Angular Material design system.</w:t>
+      </w:r>
+    </w:p>
+    <w:p>
+      <w:pPr>
+        <w:numPr>
+          <w:ilvl w:val="0"/>
+          <w:numId w:val="1"/>
+        </w:numPr>
+        <w:ind w:left="720" w:hanging="360"/>
+        <w:rPr>
+          <w:sz w:val="14"/>
+          <w:szCs w:val="14"/>
+        </w:rPr>
+      </w:pPr>
+      <w:r>
+        <w:rPr>
+          <w:sz w:val="22"/>
+          <w:szCs w:val="22"/>
+          <w:rtl w:val="0"/>
+        </w:rPr>
+        <w:t xml:space="preserve">Authored Playwright end-to-end tests across all three apps — multi-project config with per-app auth and storage-state reuse, synthetic-persona data factories with automated cleanup, and traces/video-on-failure with CI-ready JUnit reporting — complementing Vitest unit coverage; leveraged AI agents (Claude, OpenCode) to generate test data factories and review coverage gaps.</w:t>
       </w:r>
       <w:r>
         <w:rPr>

</xml_diff>

<commit_message>
Bump experience to 3.5+ yrs, deduplicate Netpower bullets, link live résumé
- 3+ -> 3.5+ years across meta description, schema.org, hero lede, proof
  stat, and the Angular skill line (site + resume + README)
- Netpower senior-role bullets (site + resume) no longer restate the same
  scope as the earlier Software Engineer bullets — now describe the
  distinct ownership/scope-growth angle instead
- Contact section: added a "Résumé" button linking to the live Google Doc

Co-Authored-By: Claude Sonnet 5 <noreply@anthropic.com>
Claude-Session: https://claude.ai/code/session_01JUJhnDimpidYSon4YRWqPa
</commit_message>
<xml_diff>
--- a/resume.docx
+++ b/resume.docx
@@ -165,7 +165,7 @@
           <w:szCs w:val="22"/>
           <w:rtl w:val="0"/>
         </w:rPr>
-        <w:t xml:space="preserve">Senior software engineer with 3+ years delivering enterprise </w:t>
+        <w:t xml:space="preserve">Senior software engineer with 3.5+ years delivering enterprise </w:t>
       </w:r>
       <w:r>
         <w:rPr>
@@ -304,7 +304,7 @@
           <w:szCs w:val="22"/>
           <w:rtl w:val="0"/>
         </w:rPr>
-        <w:t xml:space="preserve">Drive signals-first Angular 21 feature delivery across the Deviation, Checklist, and Handbook modules of Certain QMS, with expanded ownership of module architecture and code review.</w:t>
+        <w:t xml:space="preserve">Took ownership of module architecture decisions and code review across the team, raising the bar for signal-store design and type safety as new modules ship.</w:t>
       </w:r>
     </w:p>
     <w:p>
@@ -325,7 +325,7 @@
           <w:szCs w:val="22"/>
           <w:rtl w:val="0"/>
         </w:rPr>
-        <w:t xml:space="preserve">Own end-to-end quality across all three apps — Playwright e2e and Vitest strategy, with AI agents (Claude, OpenCode) generating test data factories and flagging coverage gaps.</w:t>
+        <w:t xml:space="preserve">Extended the Playwright/Vitest testing strategy into new coverage areas across all three apps as functionality grows.</w:t>
       </w:r>
     </w:p>
     <w:p>
@@ -920,7 +920,7 @@
           <w:bCs w:val="0"/>
           <w:rtl w:val="0"/>
         </w:rPr>
-        <w:t xml:space="preserve">Angular (3+ years), React, Next.js, TypeScript, JavaScript ES6+, RxJS, NgRx Signal Store, PrimeNG, Angular Material, TailwindCSS, Chart.js</w:t>
+        <w:t xml:space="preserve">Angular (3.5+ years), React, Next.js, TypeScript, JavaScript ES6+, RxJS, NgRx Signal Store, PrimeNG, Angular Material, TailwindCSS, Chart.js</w:t>
       </w:r>
     </w:p>
     <w:p>

</xml_diff>

<commit_message>
Rename e-commerce project, reflow work grid, rebalance Netpower bullets
- E-commerce card renamed to "DebuggerMind Commerce" with its real live
  link (pogiit.com); reframed as an in-house demo platform rather than
  a client project, now a clickable card like CampusQ
- Angular libraries card no longer spans full width, so it sits beside
  the e-commerce card in the grid
- Netpower timeline (site + resume): Senior Software Engineer II grows
  from 2 to 4 bullets (architecture ownership, test strategy, reporting/
  localization foundations, AI workflow adoption); Software Engineer
  condenses from 5 bullets to 2
- Contact button label simplified from "Résumé" to "Resume"

Co-Authored-By: Claude Sonnet 5 <noreply@anthropic.com>
Claude-Session: https://claude.ai/code/session_01JUJhnDimpidYSon4YRWqPa
</commit_message>
<xml_diff>
--- a/resume.docx
+++ b/resume.docx
@@ -304,7 +304,7 @@
           <w:szCs w:val="22"/>
           <w:rtl w:val="0"/>
         </w:rPr>
-        <w:t xml:space="preserve">Took ownership of module architecture decisions and code review across the team, raising the bar for signal-store design and type safety as new modules ship.</w:t>
+        <w:t xml:space="preserve">Own architecture decisions and code review for the Deviation, Checklist, and Handbook modules, setting the standard for signal-store design, type safety, and OnPush patterns other engineers build against.</w:t>
       </w:r>
     </w:p>
     <w:p>
@@ -325,39 +325,7 @@
           <w:szCs w:val="22"/>
           <w:rtl w:val="0"/>
         </w:rPr>
-        <w:t xml:space="preserve">Extended the Playwright/Vitest testing strategy into new coverage areas across all three apps as functionality grows.</w:t>
-      </w:r>
-    </w:p>
-    <w:p>
-      <w:pPr>
-        <w:pStyle w:val="Heading3"/>
-        <w:spacing w:before="0" w:lineRule="auto"/>
-        <w:rPr>
-          <w:i w:val="1"/>
-          <w:iCs w:val="1"/>
-        </w:rPr>
-      </w:pPr>
-      <w:r>
-        <w:rPr>
-          <w:b w:val="1"/>
-          <w:bCs w:val="1"/>
-          <w:rtl w:val="0"/>
-        </w:rPr>
-        <w:t xml:space="preserve">Software Engineer</w:t>
-      </w:r>
-      <w:r>
-        <w:rPr>
-          <w:rtl w:val="0"/>
-        </w:rPr>
-        <w:t xml:space="preserve">, Netpower,</w:t>
-      </w:r>
-      <w:r>
-        <w:rPr>
-          <w:i w:val="1"/>
-          <w:iCs w:val="1"/>
-          <w:rtl w:val="0"/>
-        </w:rPr>
-        <w:t xml:space="preserve"> March 2026 – June 2026</w:t>
+        <w:t xml:space="preserve">Drive the Playwright and Vitest testing strategy across all three apps, extending coverage and directing AI-assisted test data generation as new modules ship.</w:t>
       </w:r>
     </w:p>
     <w:p>
@@ -378,7 +346,7 @@
           <w:szCs w:val="22"/>
           <w:rtl w:val="0"/>
         </w:rPr>
-        <w:t xml:space="preserve">Built standalone, Signals-first Angular 21 features across the Deviation, Checklist, and Handbook modules for Certain QMS — signal/computed/effect stores scoped per route (ngRx signal store), reactive forms, functional guards/resolvers, lazy routes, and HTTP interceptors — under strict TypeScript and OnPush change detection; used Claude and Cursor agents to accelerate component scaffolding and TypeScript type design.</w:t>
+        <w:t xml:space="preserve">Extend the reporting/export and localization foundations (Chart.js, @ngx-translate) to new modules as Certain QMS scope grows.</w:t>
       </w:r>
     </w:p>
     <w:p>
@@ -399,7 +367,39 @@
           <w:szCs w:val="22"/>
           <w:rtl w:val="0"/>
         </w:rPr>
-        <w:t xml:space="preserve">Delivered Chart.js analytics dashboards (donut, gauge, risk-matrix, trend) with saved-search and date-range filtering, plus multi-format export — locale-aware Excel (xlsx-js-style), styled Word (docx), and inline PDF — and Quill rich text editing for deviation records.</w:t>
+        <w:t xml:space="preserve">Guide adoption of AI-assisted workflows (Claude, Cursor, OpenCode) for component scaffolding and code review across the team.</w:t>
+      </w:r>
+    </w:p>
+    <w:p>
+      <w:pPr>
+        <w:pStyle w:val="Heading3"/>
+        <w:spacing w:before="0" w:lineRule="auto"/>
+        <w:rPr>
+          <w:i w:val="1"/>
+          <w:iCs w:val="1"/>
+        </w:rPr>
+      </w:pPr>
+      <w:r>
+        <w:rPr>
+          <w:b w:val="1"/>
+          <w:bCs w:val="1"/>
+          <w:rtl w:val="0"/>
+        </w:rPr>
+        <w:t xml:space="preserve">Software Engineer</w:t>
+      </w:r>
+      <w:r>
+        <w:rPr>
+          <w:rtl w:val="0"/>
+        </w:rPr>
+        <w:t xml:space="preserve">, Netpower,</w:t>
+      </w:r>
+      <w:r>
+        <w:rPr>
+          <w:i w:val="1"/>
+          <w:iCs w:val="1"/>
+          <w:rtl w:val="0"/>
+        </w:rPr>
+        <w:t xml:space="preserve"> March 2026 – June 2026</w:t>
       </w:r>
     </w:p>
     <w:p>
@@ -420,7 +420,7 @@
           <w:szCs w:val="22"/>
           <w:rtl w:val="0"/>
         </w:rPr>
-        <w:t xml:space="preserve">Contributed to a dual-authentication model: a JWT interceptor for internal users and a route-scoped OTP session flow enabling secure, read-only external sharing of deviation records without exposing internal logins.</w:t>
+        <w:t xml:space="preserve">Built standalone, Signals-first Angular 21 features across the Deviation, Checklist, and Handbook modules for Certain QMS — per-route ngRx signal stores, a dual JWT/OTP authentication model, Chart.js analytics dashboards with multi-format export (Excel, Word, PDF), and Quill rich text editing — under strict TypeScript and OnPush change detection; used Claude and Cursor agents to accelerate component scaffolding.</w:t>
       </w:r>
     </w:p>
     <w:p>
@@ -441,33 +441,7 @@
           <w:szCs w:val="22"/>
           <w:rtl w:val="0"/>
         </w:rPr>
-        <w:t xml:space="preserve">Shipped fully localized UI via @ngx-translate (Norwegian bokmål/nynorsk + English, 1,000+ keys) with locale-driven date/number formatting, extending shared sdk-ui/cdk-ui libraries on a Tailwind 4 + custom Angular Material design system.</w:t>
-      </w:r>
-    </w:p>
-    <w:p>
-      <w:pPr>
-        <w:numPr>
-          <w:ilvl w:val="0"/>
-          <w:numId w:val="1"/>
-        </w:numPr>
-        <w:ind w:left="720" w:hanging="360"/>
-        <w:rPr>
-          <w:sz w:val="14"/>
-          <w:szCs w:val="14"/>
-        </w:rPr>
-      </w:pPr>
-      <w:r>
-        <w:rPr>
-          <w:sz w:val="22"/>
-          <w:szCs w:val="22"/>
-          <w:rtl w:val="0"/>
-        </w:rPr>
-        <w:t xml:space="preserve">Authored Playwright end-to-end tests across all three apps — multi-project config with per-app auth and storage-state reuse, synthetic-persona data factories with automated cleanup, and traces/video-on-failure with CI-ready JUnit reporting — complementing Vitest unit coverage; leveraged AI agents (Claude, OpenCode) to generate test data factories and review coverage gaps.</w:t>
-      </w:r>
-      <w:r>
-        <w:rPr>
-          <w:rtl w:val="0"/>
-        </w:rPr>
+        <w:t xml:space="preserve">Shipped fully localized UI via @ngx-translate (Norwegian bokmål/nynorsk + English, 1,000+ keys) and authored the Playwright and Vitest testing foundation across all three apps — multi-project config, synthetic-persona data factories, and CI-ready reporting — using AI agents (Claude, OpenCode) to generate test data and flag coverage gaps.</w:t>
       </w:r>
     </w:p>
     <w:p>

</xml_diff>

<commit_message>
Remove Senior Software Engineer II title from resume and portfolio
Not holding the promoted title publicly for now. Reverts the Netpower
entry (site + resume) to a single "Software Engineer" role spanning
March 2026 - Present, and the resume summary back to plain "Software
engineer." Removes the now-unused LinkedIn-style sub-timeline CSS/markup
that split the role in two.

Co-Authored-By: Claude Sonnet 5 <noreply@anthropic.com>
Claude-Session: https://claude.ai/code/session_01JUJhnDimpidYSon4YRWqPa
</commit_message>
<xml_diff>
--- a/resume.docx
+++ b/resume.docx
@@ -165,7 +165,7 @@
           <w:szCs w:val="22"/>
           <w:rtl w:val="0"/>
         </w:rPr>
-        <w:t xml:space="preserve">Senior software engineer with 3.5+ years delivering enterprise </w:t>
+        <w:t xml:space="preserve">Software engineer with 3.5+ years delivering enterprise </w:t>
       </w:r>
       <w:r>
         <w:rPr>
@@ -261,15 +261,13 @@
           <w:iCs w:val="1"/>
         </w:rPr>
       </w:pPr>
-      <w:bookmarkStart w:colFirst="0" w:colLast="0" w:name="_heading=h.i7spct2tv311" w:id="3"/>
-      <w:bookmarkEnd w:id="3"/>
       <w:r>
         <w:rPr>
           <w:b w:val="1"/>
           <w:bCs w:val="1"/>
           <w:rtl w:val="0"/>
         </w:rPr>
-        <w:t xml:space="preserve">Senior Software Engineer II</w:t>
+        <w:t xml:space="preserve">Software Engineer</w:t>
       </w:r>
       <w:r>
         <w:rPr>
@@ -283,123 +281,7 @@
           <w:iCs w:val="1"/>
           <w:rtl w:val="0"/>
         </w:rPr>
-        <w:t xml:space="preserve"> July 2026 – Present</w:t>
-      </w:r>
-    </w:p>
-    <w:p>
-      <w:pPr>
-        <w:numPr>
-          <w:ilvl w:val="0"/>
-          <w:numId w:val="1"/>
-        </w:numPr>
-        <w:ind w:left="720" w:hanging="360"/>
-        <w:rPr>
-          <w:sz w:val="14"/>
-          <w:szCs w:val="14"/>
-        </w:rPr>
-      </w:pPr>
-      <w:r>
-        <w:rPr>
-          <w:sz w:val="22"/>
-          <w:szCs w:val="22"/>
-          <w:rtl w:val="0"/>
-        </w:rPr>
-        <w:t xml:space="preserve">Own architecture decisions and code review for the Deviation, Checklist, and Handbook modules, setting the standard for signal-store design, type safety, and OnPush patterns other engineers build against.</w:t>
-      </w:r>
-    </w:p>
-    <w:p>
-      <w:pPr>
-        <w:numPr>
-          <w:ilvl w:val="0"/>
-          <w:numId w:val="1"/>
-        </w:numPr>
-        <w:ind w:left="720" w:hanging="360"/>
-        <w:rPr>
-          <w:sz w:val="14"/>
-          <w:szCs w:val="14"/>
-        </w:rPr>
-      </w:pPr>
-      <w:r>
-        <w:rPr>
-          <w:sz w:val="22"/>
-          <w:szCs w:val="22"/>
-          <w:rtl w:val="0"/>
-        </w:rPr>
-        <w:t xml:space="preserve">Drive the Playwright and Vitest testing strategy across all three apps, extending coverage and directing AI-assisted test data generation as new modules ship.</w:t>
-      </w:r>
-    </w:p>
-    <w:p>
-      <w:pPr>
-        <w:numPr>
-          <w:ilvl w:val="0"/>
-          <w:numId w:val="1"/>
-        </w:numPr>
-        <w:ind w:left="720" w:hanging="360"/>
-        <w:rPr>
-          <w:sz w:val="14"/>
-          <w:szCs w:val="14"/>
-        </w:rPr>
-      </w:pPr>
-      <w:r>
-        <w:rPr>
-          <w:sz w:val="22"/>
-          <w:szCs w:val="22"/>
-          <w:rtl w:val="0"/>
-        </w:rPr>
-        <w:t xml:space="preserve">Extend the reporting/export and localization foundations (Chart.js, @ngx-translate) to new modules as Certain QMS scope grows.</w:t>
-      </w:r>
-    </w:p>
-    <w:p>
-      <w:pPr>
-        <w:numPr>
-          <w:ilvl w:val="0"/>
-          <w:numId w:val="1"/>
-        </w:numPr>
-        <w:ind w:left="720" w:hanging="360"/>
-        <w:rPr>
-          <w:sz w:val="14"/>
-          <w:szCs w:val="14"/>
-        </w:rPr>
-      </w:pPr>
-      <w:r>
-        <w:rPr>
-          <w:sz w:val="22"/>
-          <w:szCs w:val="22"/>
-          <w:rtl w:val="0"/>
-        </w:rPr>
-        <w:t xml:space="preserve">Guide adoption of AI-assisted workflows (Claude, Cursor, OpenCode) for component scaffolding and code review across the team.</w:t>
-      </w:r>
-    </w:p>
-    <w:p>
-      <w:pPr>
-        <w:pStyle w:val="Heading3"/>
-        <w:spacing w:before="0" w:lineRule="auto"/>
-        <w:rPr>
-          <w:i w:val="1"/>
-          <w:iCs w:val="1"/>
-        </w:rPr>
-      </w:pPr>
-      <w:r>
-        <w:rPr>
-          <w:b w:val="1"/>
-          <w:bCs w:val="1"/>
-          <w:rtl w:val="0"/>
-        </w:rPr>
-        <w:t xml:space="preserve">Software Engineer</w:t>
-      </w:r>
-      <w:r>
-        <w:rPr>
-          <w:rtl w:val="0"/>
-        </w:rPr>
-        <w:t xml:space="preserve">, Netpower,</w:t>
-      </w:r>
-      <w:r>
-        <w:rPr>
-          <w:i w:val="1"/>
-          <w:iCs w:val="1"/>
-          <w:rtl w:val="0"/>
-        </w:rPr>
-        <w:t xml:space="preserve"> March 2026 – June 2026</w:t>
+        <w:t xml:space="preserve"> March 2026 – Present</w:t>
       </w:r>
     </w:p>
     <w:p>

</xml_diff>

<commit_message>
Merge Senior Software Engineer II bullets into the single role
The prior removal deleted the senior-scope bullets outright instead of
folding their substance into the merged Software Engineer entry. Adds
two bullets (architecture/code review + test strategy, reporting/
localization foundations + AI workflow adoption) back to both the site
timeline and resume, reworded without title-specific ownership framing.

Co-Authored-By: Claude Sonnet 5 <noreply@anthropic.com>
Claude-Session: https://claude.ai/code/session_01JUJhnDimpidYSon4YRWqPa
</commit_message>
<xml_diff>
--- a/resume.docx
+++ b/resume.docx
@@ -324,6 +324,48 @@
           <w:rtl w:val="0"/>
         </w:rPr>
         <w:t xml:space="preserve">Shipped fully localized UI via @ngx-translate (Norwegian bokmål/nynorsk + English, 1,000+ keys) and authored the Playwright and Vitest testing foundation across all three apps — multi-project config, synthetic-persona data factories, and CI-ready reporting — using AI agents (Claude, OpenCode) to generate test data and flag coverage gaps.</w:t>
+      </w:r>
+    </w:p>
+    <w:p>
+      <w:pPr>
+        <w:numPr>
+          <w:ilvl w:val="0"/>
+          <w:numId w:val="1"/>
+        </w:numPr>
+        <w:ind w:left="720" w:hanging="360"/>
+        <w:rPr>
+          <w:sz w:val="14"/>
+          <w:szCs w:val="14"/>
+        </w:rPr>
+      </w:pPr>
+      <w:r>
+        <w:rPr>
+          <w:sz w:val="22"/>
+          <w:szCs w:val="22"/>
+          <w:rtl w:val="0"/>
+        </w:rPr>
+        <w:t xml:space="preserve">Contribute to architecture decisions and code review across the Deviation, Checklist, and Handbook modules, and extend the Playwright/Vitest testing strategy as new modules ship.</w:t>
+      </w:r>
+    </w:p>
+    <w:p>
+      <w:pPr>
+        <w:numPr>
+          <w:ilvl w:val="0"/>
+          <w:numId w:val="1"/>
+        </w:numPr>
+        <w:ind w:left="720" w:hanging="360"/>
+        <w:rPr>
+          <w:sz w:val="14"/>
+          <w:szCs w:val="14"/>
+        </w:rPr>
+      </w:pPr>
+      <w:r>
+        <w:rPr>
+          <w:sz w:val="22"/>
+          <w:szCs w:val="22"/>
+          <w:rtl w:val="0"/>
+        </w:rPr>
+        <w:t xml:space="preserve">Extend the reporting/export and localization foundations (Chart.js, @ngx-translate) to new modules, and help drive adoption of AI-assisted workflows (Claude, Cursor, OpenCode) across the team.</w:t>
       </w:r>
     </w:p>
     <w:p>

</xml_diff>